<commit_message>
[pncs-review] Regenerate Word doc (R5 final)
</commit_message>
<xml_diff>
--- a/manuscript/PNCS_Neurodevelopment_Review.docx
+++ b/manuscript/PNCS_Neurodevelopment_Review.docx
@@ -148,7 +148,7 @@
           <w:rFonts w:ascii="Times New Roman" w:hAnsi="Times New Roman"/>
           <w:sz w:val="24"/>
         </w:rPr>
-        <w:t>~6,804 words (body); ~7,604 including references</w:t>
+        <w:t>~7,006 words (body); ~7,806 including references</w:t>
       </w:r>
     </w:p>
     <w:p>
@@ -720,7 +720,7 @@
           <w:i w:val="0"/>
           <w:sz w:val="24"/>
         </w:rPr>
-        <w:t>Neurological outcomes. Critically, the cerebral palsy signal was attenuated. Late initiation was not associated with a statistically significant increase in cerebral palsy (RR 1.12, 95% CI 0.81–1.54; NNH approximately 50, though the confidence interval does not exclude a clinically meaningful increase of up to approximately 1 in 18). Mortality was reduced (RR 0.81, 95% CI 0.66–0.99), a finding not observed in the early administration review.</w:t>
+        <w:t>Neurological outcomes. Critically, the cerebral palsy signal was attenuated. Late initiation was not associated with a statistically significant increase in cerebral palsy (RR 1.12, 95% CI 0.81–1.54; NNH approximately 50, though the confidence interval does not exclude a clinically meaningful increase of up to approximately 1 in 18). Mortality was reduced (RR 0.81, 95% CI 0.66–0.99; high-certainty GRADE), a finding not observed in the early administration review.</w:t>
       </w:r>
     </w:p>
     <w:p>
@@ -1370,7 +1370,7 @@
           <w:i w:val="0"/>
           <w:sz w:val="24"/>
         </w:rPr>
-        <w:t>Two Cochrane reviews have synthesized the inhaled corticosteroid evidence [27,28]. Early (≤2 weeks) inhaled corticosteroids may reduce BPD (RR 0.76, 95% CI 0.63–0.93), but the estimate is imprecise and the quality of evidence is low to moderate. Late (&gt;2 weeks) inhaled corticosteroids show a trend toward reduced BPD that does not reach statistical significance (RR 0.90, 95% CI 0.73–1.11). Neurodevelopmental follow-up data are extremely limited: only NEUROSIS has reported outcomes beyond hospital discharge, and as described above, those data demonstrated higher rates of neurodevelopmental impairment among survivors — not reassurance of safety [31].</w:t>
+        <w:t>Two Cochrane reviews have synthesized the inhaled corticosteroid evidence [27,28]. Early (≤2 weeks) inhaled corticosteroids may reduce BPD (RR 0.76, 95% CI 0.63–0.93; ARR ~9.6%, NNT ~10, assuming ~40% baseline BPD risk), but the estimate is imprecise and the quality of evidence is low to moderate. Late (&gt;2 weeks) inhaled corticosteroids show a trend toward reduced BPD that does not reach statistical significance (RR 0.90, 95% CI 0.73–1.11). Neurodevelopmental follow-up data are extremely limited: only NEUROSIS has reported outcomes beyond hospital discharge, and as described above, those data demonstrated higher rates of neurodevelopmental impairment among survivors — not reassurance of safety [31].</w:t>
       </w:r>
     </w:p>
     <w:p>
@@ -2212,7 +2212,7 @@
           <w:i w:val="0"/>
           <w:sz w:val="24"/>
         </w:rPr>
-        <w:t>The single most critical limitation of the postnatal corticosteroid evidence base is the temporal truncation of follow-up. Of the 55 RCTs included in the early and late Cochrane reviews, the longest neurodevelopmental follow-up reported was 2 years. No randomized trial has assessed cognitive, behavioral, academic, or pulmonary outcomes at school age or beyond. This gap is not attributable to feasibility — the CAP trial (caffeine) achieved 82% follow-up at 5 years and reported outcomes at 11 years [33] — but to a failure of research prioritization.</w:t>
+        <w:t>The single most critical limitation of the postnatal corticosteroid evidence base is the temporal truncation of follow-up. Of the 55 RCTs included in the early and late Cochrane reviews, the longest neurodevelopmental follow-up reported was 2 years. Beyond the Yeh et al. school-age follow-up of a single early dexamethasone trial [37] — which demonstrated cognitive deficits but was an observational follow-up of a previously randomized cohort — no randomized trial has assessed cognitive, behavioral, academic, or pulmonary outcomes at school age or beyond as a pre-specified endpoint. This gap is not attributable to feasibility — the CAP trial (caffeine) achieved 82% follow-up at 5 years and reported outcomes at 11 years [33] — but to a failure of research prioritization.</w:t>
       </w:r>
     </w:p>
     <w:p>
@@ -2321,6 +2321,32 @@
     </w:p>
     <w:p>
       <w:pPr>
+        <w:pStyle w:val="Heading2"/>
+      </w:pPr>
+      <w:r>
+        <w:rPr>
+          <w:rFonts w:ascii="Times New Roman" w:hAnsi="Times New Roman"/>
+          <w:color w:val="000000"/>
+        </w:rPr>
+        <w:t>8.6 A Global Perspective</w:t>
+      </w:r>
+    </w:p>
+    <w:p>
+      <w:pPr>
+        <w:spacing w:line="480" w:lineRule="auto"/>
+      </w:pPr>
+      <w:r>
+        <w:rPr>
+          <w:rFonts w:ascii="Times New Roman" w:hAnsi="Times New Roman"/>
+          <w:b w:val="0"/>
+          <w:i w:val="0"/>
+          <w:sz w:val="24"/>
+        </w:rPr>
+        <w:t>This review has been written from a high-income country perspective, and its recommendations assume the infrastructure of a well-resourced NICU. In low- and middle-income countries (LMICs), the calculus differs. Dexamethasone is widely available and inexpensive, while hydrocortisone and inhaled budesonide may not be stocked. Mechanical ventilation capacity is limited, and infants who survive NRDS in these settings may face different BPD trajectories — shaped by variable oxygen delivery, higher infection burdens, and near-total absence of post-discharge follow-up. Crucially, the neurodevelopmental follow-up data on which this review relies were generated almost exclusively in high-income countries; whether the risk-benefit ratio of postnatal corticosteroids differs in LMIC populations with different baseline risks, co-morbidities, and genetic backgrounds is unknown. Research conducted in, and responsive to the needs of, LMIC settings should be a priority for the field.</w:t>
+      </w:r>
+    </w:p>
+    <w:p>
+      <w:pPr>
         <w:pStyle w:val="Heading1"/>
       </w:pPr>
       <w:r>
@@ -2356,7 +2382,7 @@
           <w:i w:val="0"/>
           <w:sz w:val="24"/>
         </w:rPr>
-        <w:t>Beyond the NICU discharge, the evidence base thins to near-invisibility. The neurodevelopmental outcomes that matter most to children and families — school-age cognition, executive function, academic achievement, behavior, quality of life, and adult health status — have not been measured in a single randomized trial of postnatal corticosteroids. The follow-up gap is not a methodological quirk; it is the central failure of the research enterprise in this field. We know with high certainty what postnatal corticosteroids do to the preterm lung and the 2-year-old brain. We do not know what they do to the 8-year-old child, the 16-year-old adolescent, or the 40-year-old adult.</w:t>
+        <w:t>Beyond the NICU discharge, the evidence base thins to near-invisibility. The neurodevelopmental outcomes that matter most to children and families — school-age cognition, executive function, academic achievement, behavior, quality of life, and adult health status — have been assessed in school-age follow-up of only one randomized trial [37]; for every other corticosteroid trial, these outcomes remain unmeasured. The follow-up gap is not a methodological quirk; it is the central failure of the research enterprise in this field. We know with high certainty what postnatal corticosteroids do to the preterm lung and the 2-year-old brain. We do not know what they do to the 8-year-old child, the 16-year-old adolescent, or the 40-year-old adult.</w:t>
       </w:r>
     </w:p>
     <w:p>

</xml_diff>

<commit_message>
[pncs-review] Regenerate Word doc (R6 — 7,576词正文)
</commit_message>
<xml_diff>
--- a/manuscript/PNCS_Neurodevelopment_Review.docx
+++ b/manuscript/PNCS_Neurodevelopment_Review.docx
@@ -148,7 +148,7 @@
           <w:rFonts w:ascii="Times New Roman" w:hAnsi="Times New Roman"/>
           <w:sz w:val="24"/>
         </w:rPr>
-        <w:t>~7,006 words (body); ~7,806 including references</w:t>
+        <w:t>~6,615 words (body); ~7,415 including references</w:t>
       </w:r>
     </w:p>
     <w:p>
@@ -360,7 +360,7 @@
           <w:i w:val="0"/>
           <w:sz w:val="24"/>
         </w:rPr>
-        <w:t>Neonatal respiratory distress syndrome (NRDS), a disease of surfactant deficiency in preterm infants, remains a leading cause of neonatal morbidity and mortality worldwide [1]. For infants who survive the acute phase of NRDS but develop bronchopulmonary dysplasia (BPD) — a chronic lung disease characterized by impaired alveolarization and pulmonary vascular development — the clinical trajectory extends far beyond the neonatal intensive care unit (NICU). BPD affects approximately 40% of infants born before 28 weeks' gestation [1] and is independently associated with adverse neurodevelopmental outcomes, rehospitalization, and reduced quality of life throughout childhood [29].</w:t>
+        <w:t>For preterm infants who survive neonatal respiratory distress syndrome (NRDS) but develop bronchopulmonary dysplasia (BPD) — affecting approximately 40% of those born before 28 weeks' gestation [1] — the clinical trajectory extends far beyond the neonatal intensive care unit (NICU). BPD is independently associated with adverse neurodevelopmental outcomes, rehospitalization, and reduced quality of life throughout childhood [29].</w:t>
       </w:r>
     </w:p>
     <w:p>
@@ -828,7 +828,7 @@
           <w:i w:val="0"/>
           <w:sz w:val="24"/>
         </w:rPr>
-        <w:t>A variable that cuts across the timing-agent taxonomy is cumulative corticosteroid dose. The early dexamethasone trials that generated the CP signal (Section 2.2) typically used prolonged tapering courses — 28 to 42 days — with cumulative doses exceeding 5 mg/kg of dexamethasone [4]. In contrast, the DART trial, which found no significant increase in CP, used a 10-day course with a total cumulative dose of 0.89 mg/kg [15]. The PREMILOC hydrocortisone regimen totaled 8.5 mg/kg over 10 days — a far lower glucocorticoid receptor burden than the early dexamethasone courses, regardless of the chosen potency-equivalence ratio [16]. By any standard metric, these lower-dose regimens expose the developing brain to substantially less glucocorticoid activity than the early high-dose dexamethasone trials.</w:t>
+        <w:t>A variable that cuts across the timing-agent taxonomy is cumulative corticosteroid dose. The early dexamethasone trials that generated the CP signal (Section 2.2) typically used prolonged tapering courses — 28 to 42 days — with cumulative doses exceeding 5 mg/kg of dexamethasone [4]. In contrast, subsequent trials using far lower cumulative exposures — whether low-dose late dexamethasone or low-dose early hydrocortisone — found reassuring neurodevelopmental profiles, as detailed in Section 4. This dose gradient confounds the clean interpretation of "early vs. late" or "dexamethasone vs. hydrocortisone" as the sole determinants of neurodevelopmental risk: a trial that used a low cumulative dose of the "wrong" agent at the "wrong" time can still produce a reassuring neurodevelopmental outcome, suggesting that dose may be as important as timing or agent choice. This hypothesis is biologically coherent: glucocorticoid receptor-mediated neurotoxicity is dose-dependent in animal models [9], and the developing brain's vulnerability follows a gradient rather than a binary threshold.</w:t>
       </w:r>
     </w:p>
     <w:p>
@@ -842,21 +842,7 @@
           <w:i w:val="0"/>
           <w:sz w:val="24"/>
         </w:rPr>
-        <w:t>This dose gradient confounds the clean interpretation of "early vs. late" or "dexamethasone vs. hydrocortisone" as the sole determinants of neurodevelopmental risk. The DART trial, which used late, low-dose dexamethasone, and the PREMILOC trial, which used early, low-dose hydrocortisone, both found reassuring neurodevelopmental profiles — suggesting that dose may be as important as timing or agent choice in determining the neurodevelopmental safety of postnatal corticosteroids. This hypothesis is biologically coherent: glucocorticoid receptor-mediated neurotoxicity is dose-dependent in animal models [9], and the developing brain's vulnerability follows a gradient rather than a binary threshold.</w:t>
-      </w:r>
-    </w:p>
-    <w:p>
-      <w:pPr>
-        <w:spacing w:line="480" w:lineRule="auto"/>
-      </w:pPr>
-      <w:r>
-        <w:rPr>
-          <w:rFonts w:ascii="Times New Roman" w:hAnsi="Times New Roman"/>
-          <w:b w:val="0"/>
-          <w:i w:val="0"/>
-          <w:sz w:val="24"/>
-        </w:rPr>
-        <w:t>No trial has directly compared different cumulative doses of the same corticosteroid for the same timing window, so the dose-response relationship remains inferred rather than experimentally confirmed. The practical implication is that when postnatal corticosteroids are deemed necessary, the lowest effective dose for the shortest effective duration — a principle borrowed from general corticosteroid pharmacology — should guide clinical decisions, pending direct evidence.</w:t>
+        <w:t>No trial has directly compared different cumulative doses of the same corticosteroid for the same timing window, so the dose-response relationship remains inferred rather than experimentally confirmed. The practical implication is that when postnatal corticosteroids are deemed necessary, the lowest effective dose for the shortest effective duration should guide clinical decisions, pending direct evidence.</w:t>
       </w:r>
     </w:p>
     <w:p>
@@ -1248,21 +1234,7 @@
           <w:i w:val="0"/>
           <w:sz w:val="24"/>
         </w:rPr>
-        <w:t>Inhaled corticosteroids offer a conceptually attractive approach: direct delivery of anti-inflammatory therapy to the pulmonary epithelium, with theoretically reduced systemic absorption and consequently reduced neurodevelopmental risk. Budesonide, beclomethasone, and fluticasone have all been studied in preterm infants, with budesonide receiving the most rigorous evaluation [27,28].</w:t>
-      </w:r>
-    </w:p>
-    <w:p>
-      <w:pPr>
-        <w:spacing w:line="480" w:lineRule="auto"/>
-      </w:pPr>
-      <w:r>
-        <w:rPr>
-          <w:rFonts w:ascii="Times New Roman" w:hAnsi="Times New Roman"/>
-          <w:b w:val="0"/>
-          <w:i w:val="0"/>
-          <w:sz w:val="24"/>
-        </w:rPr>
-        <w:t>However, the "local therapy" premise deserves scrutiny. Systemic absorption of inhaled corticosteroids is not negligible in preterm infants. Budesonide administered via nebulizer or metered-dose inhaler produces measurable plasma concentrations, and the preterm infant's immature hepatic metabolism and reduced protein binding may result in higher free drug concentrations than in older populations [29]. The degree to which inhaled corticosteroids are truly "topical" versus "systemic by a different route" remains incompletely characterized.</w:t>
+        <w:t>Inhaled corticosteroids offer a conceptually attractive approach — direct pulmonary delivery with theoretically reduced systemic absorption — but the "local therapy" premise deserves scrutiny. Budesonide administered via nebulizer or metered-dose inhaler produces measurable plasma concentrations in preterm infants, whose immature hepatic metabolism may result in higher free drug concentrations than in older populations [29]. Whether inhaled corticosteroids are truly topical rather than systemic by a different route remains incompletely characterized.</w:t>
       </w:r>
     </w:p>
     <w:p>
@@ -1370,21 +1342,7 @@
           <w:i w:val="0"/>
           <w:sz w:val="24"/>
         </w:rPr>
-        <w:t>Two Cochrane reviews have synthesized the inhaled corticosteroid evidence [27,28]. Early (≤2 weeks) inhaled corticosteroids may reduce BPD (RR 0.76, 95% CI 0.63–0.93; ARR ~9.6%, NNT ~10, assuming ~40% baseline BPD risk), but the estimate is imprecise and the quality of evidence is low to moderate. Late (&gt;2 weeks) inhaled corticosteroids show a trend toward reduced BPD that does not reach statistical significance (RR 0.90, 95% CI 0.73–1.11). Neurodevelopmental follow-up data are extremely limited: only NEUROSIS has reported outcomes beyond hospital discharge, and as described above, those data demonstrated higher rates of neurodevelopmental impairment among survivors — not reassurance of safety [31].</w:t>
-      </w:r>
-    </w:p>
-    <w:p>
-      <w:pPr>
-        <w:spacing w:line="480" w:lineRule="auto"/>
-      </w:pPr>
-      <w:r>
-        <w:rPr>
-          <w:rFonts w:ascii="Times New Roman" w:hAnsi="Times New Roman"/>
-          <w:b w:val="0"/>
-          <w:i w:val="0"/>
-          <w:sz w:val="24"/>
-        </w:rPr>
-        <w:t>The Cochrane authors' conclusions are measured: "There is insufficient evidence to support the routine use of inhaled corticosteroids for the prevention of BPD in preterm infants." The 2025 European RDS Consensus Guidelines do not recommend inhaled corticosteroids for BPD prevention, and the AAP has issued no endorsement.</w:t>
+        <w:t>Two Cochrane reviews have synthesized the inhaled corticosteroid evidence [27,28]. While early administration may reduce BPD, the quality of evidence is low to moderate and the effect is imprecisely estimated. Neurodevelopmental follow-up data are limited to NEUROSIS, which — as described above — demonstrated harm, not reassurance [31]. On the basis of this evidence, neither the 2025 European RDS Consensus Guidelines nor the AAP recommends inhaled corticosteroids for BPD prevention outside of research settings.</w:t>
       </w:r>
     </w:p>
     <w:p>
@@ -1476,21 +1434,7 @@
           <w:i w:val="0"/>
           <w:sz w:val="24"/>
         </w:rPr>
-        <w:t>Cerebral palsy (CP) is the neurodevelopmental outcome for which the postnatal corticosteroid evidence is most complete, primarily because it is a binary, relatively objective diagnosis that can be made with reasonable confidence by 18–24 months. The Cochrane data establish three propositions with high certainty:</w:t>
-      </w:r>
-    </w:p>
-    <w:p>
-      <w:pPr>
-        <w:spacing w:line="480" w:lineRule="auto"/>
-      </w:pPr>
-      <w:r>
-        <w:rPr>
-          <w:rFonts w:ascii="Times New Roman" w:hAnsi="Times New Roman"/>
-          <w:b w:val="0"/>
-          <w:i w:val="0"/>
-          <w:sz w:val="24"/>
-        </w:rPr>
-        <w:t>1. Early dexamethasone increases CP (RR 1.42, 95% CI 1.08–1.87; high-certainty GRADE) [7]. 2. Late dexamethasone does not conclusively increase CP (RR 1.12, 95% CI 0.81–1.54; the confidence interval is wide and a clinically meaningful increase is not excluded) [13]. 3. Hydrocortisone, regardless of timing, has not been associated with a statistically significant increase in CP in any individual trial or meta-analysis, though the evidence base is smaller and the confidence intervals wider than for dexamethasone [13].</w:t>
+        <w:t>Cerebral palsy (CP) is the neurodevelopmental outcome for which the postnatal corticosteroid evidence is most complete, primarily because it is a binary, relatively objective diagnosis that can be made with reasonable confidence by 18–24 months. The Cochrane data establish a clear gradient: early dexamethasone increases CP (high-certainty GRADE); late dexamethasone's CP risk is attenuated and not statistically significant, though a clinically meaningful increase is not excluded; and hydrocortisone has not been associated with a statistically significant increase in CP in any trial or meta-analysis [7,13].</w:t>
       </w:r>
     </w:p>
     <w:p>
@@ -1549,18 +1493,6 @@
     </w:p>
     <w:p>
       <w:pPr>
-        <w:pStyle w:val="Heading2"/>
-      </w:pPr>
-      <w:r>
-        <w:rPr>
-          <w:rFonts w:ascii="Times New Roman" w:hAnsi="Times New Roman"/>
-          <w:color w:val="000000"/>
-        </w:rPr>
-        <w:t>6.4 Behavior, Executive Function, and Academic Achievement</w:t>
-      </w:r>
-    </w:p>
-    <w:p>
-      <w:pPr>
         <w:spacing w:line="480" w:lineRule="auto"/>
       </w:pPr>
       <w:r>
@@ -1570,35 +1502,7 @@
           <w:i w:val="0"/>
           <w:sz w:val="24"/>
         </w:rPr>
-        <w:t>Even less is known about outcomes beyond the traditional domains of cognition and motor function. Two studies have reported behavioral outcomes following postnatal corticosteroids:</w:t>
-      </w:r>
-    </w:p>
-    <w:p>
-      <w:pPr>
-        <w:spacing w:line="480" w:lineRule="auto"/>
-      </w:pPr>
-      <w:r>
-        <w:rPr>
-          <w:rFonts w:ascii="Times New Roman" w:hAnsi="Times New Roman"/>
-          <w:b w:val="0"/>
-          <w:i w:val="0"/>
-          <w:sz w:val="24"/>
-        </w:rPr>
-        <w:t>- The SToP-BPD trial found significantly lower anxiety scores in hydrocortisone-treated children at 2 years' corrected age, with no differences in other CBCL domains [22]. - The CAP trial follow-up (caffeine, not corticosteroids) demonstrated that motor benefits persisted to 11 years while cognitive differences attenuated — a pattern that suggests different neurodevelopmental domains may have different developmental trajectories following neonatal pharmacological exposures [33].</w:t>
-      </w:r>
-    </w:p>
-    <w:p>
-      <w:pPr>
-        <w:spacing w:line="480" w:lineRule="auto"/>
-      </w:pPr>
-      <w:r>
-        <w:rPr>
-          <w:rFonts w:ascii="Times New Roman" w:hAnsi="Times New Roman"/>
-          <w:b w:val="0"/>
-          <w:i w:val="0"/>
-          <w:sz w:val="24"/>
-        </w:rPr>
-        <w:t>No randomized trial of postnatal corticosteroids has reported data on executive function, academic achievement, social competence, or mental health outcomes in middle childhood or adolescence. Given that these are the outcomes most relevant to quality of life and functional independence, their absence from the evidence base represents a critical limitation.</w:t>
+        <w:t>Beyond cognition, even less is known. Two studies have reported behavioral outcomes: the SToP-BPD trial found lower anxiety scores in hydrocortisone-treated children at 2 years, with no differences in other CBCL domains [22]; the CAP caffeine trial follow-up demonstrated persisting motor benefits at 11 years, suggesting that different neurodevelopmental domains may follow different trajectories following neonatal pharmacological exposures [33]. No randomized trial of postnatal corticosteroids has reported data on executive function, academic achievement, social competence, or mental health outcomes in middle childhood or adolescence — the outcomes most relevant to quality of life and functional independence.</w:t>
       </w:r>
     </w:p>
     <w:p>
@@ -1610,7 +1514,7 @@
           <w:rFonts w:ascii="Times New Roman" w:hAnsi="Times New Roman"/>
           <w:color w:val="000000"/>
         </w:rPr>
-        <w:t>6.5 The Role of BPD as a Mediator</w:t>
+        <w:t>6.4 The Role of BPD as a Mediator</w:t>
       </w:r>
     </w:p>
     <w:p>
@@ -2104,77 +2008,7 @@
           <w:i w:val="0"/>
           <w:sz w:val="24"/>
         </w:rPr>
-        <w:t>The postnatal corticosteroid decision is one for which shared decision-making is not merely desirable but ethically mandatory. The evidence base juxtaposes a tangible short-term pulmonary benefit against an uncertain long-term neurological risk, and the relative importance assigned to these outcomes varies among families.</w:t>
-      </w:r>
-    </w:p>
-    <w:p>
-      <w:pPr>
-        <w:spacing w:line="480" w:lineRule="auto"/>
-      </w:pPr>
-      <w:r>
-        <w:rPr>
-          <w:rFonts w:ascii="Times New Roman" w:hAnsi="Times New Roman"/>
-          <w:b w:val="0"/>
-          <w:i w:val="0"/>
-          <w:sz w:val="24"/>
-        </w:rPr>
-        <w:t>A framework for communicating the evidence to parents should include:</w:t>
-      </w:r>
-    </w:p>
-    <w:p>
-      <w:pPr>
-        <w:spacing w:line="480" w:lineRule="auto"/>
-      </w:pPr>
-      <w:r>
-        <w:rPr>
-          <w:rFonts w:ascii="Times New Roman" w:hAnsi="Times New Roman"/>
-          <w:b w:val="0"/>
-          <w:i w:val="0"/>
-          <w:sz w:val="24"/>
-        </w:rPr>
-        <w:t>1. Numerical framing: "For every 10 babies treated with late dexamethasone, approximately one fewer develops severe chronic lung disease. The risk of cerebral palsy — about 15 in 100 untreated babies — may be slightly higher in treated babies, but the evidence is not conclusive."</w:t>
-      </w:r>
-    </w:p>
-    <w:p>
-      <w:pPr>
-        <w:spacing w:line="480" w:lineRule="auto"/>
-      </w:pPr>
-      <w:r>
-        <w:rPr>
-          <w:rFonts w:ascii="Times New Roman" w:hAnsi="Times New Roman"/>
-          <w:b w:val="0"/>
-          <w:i w:val="0"/>
-          <w:sz w:val="24"/>
-        </w:rPr>
-        <w:t>2. Acknowledgment of uncertainty: "The studies we have follow children to age 2. We do not have good studies that followed children to school age to assess learning, behavior, or intelligence. This is a gap in our knowledge that no amount of statistical analysis can fill."</w:t>
-      </w:r>
-    </w:p>
-    <w:p>
-      <w:pPr>
-        <w:spacing w:line="480" w:lineRule="auto"/>
-      </w:pPr>
-      <w:r>
-        <w:rPr>
-          <w:rFonts w:ascii="Times New Roman" w:hAnsi="Times New Roman"/>
-          <w:b w:val="0"/>
-          <w:i w:val="0"/>
-          <w:sz w:val="24"/>
-        </w:rPr>
-        <w:t>3. Individualization: "Whether this treatment is right for your baby depends on how high their risk of severe lung disease is, and on what matters most to your family."</w:t>
-      </w:r>
-    </w:p>
-    <w:p>
-      <w:pPr>
-        <w:spacing w:line="480" w:lineRule="auto"/>
-      </w:pPr>
-      <w:r>
-        <w:rPr>
-          <w:rFonts w:ascii="Times New Roman" w:hAnsi="Times New Roman"/>
-          <w:b w:val="0"/>
-          <w:i w:val="0"/>
-          <w:sz w:val="24"/>
-        </w:rPr>
-        <w:t>The goal is not to persuade parents toward or away from treatment, but to equip them with the information — including its limitations — that they need to participate meaningfully in the decision.</w:t>
+        <w:t>The postnatal corticosteroid decision is one for which shared decision-making is not merely desirable but ethically mandatory. The evidence juxtaposes a tangible short-term pulmonary benefit against an uncertain long-term neurological risk, and the relative importance assigned to these outcomes varies among families. Clinicians should communicate the evidence numerically (e.g., late dexamethasone: NNT ~10 for BPD, NNH ~50 for CP, with the caveat that the latter does not exclude harm), acknowledge the temporal limits of follow-up (all trial data terminate at age 2, and school-age outcomes are unknown), and individualize the decision based on the infant's specific BPD risk and the family's values. The goal is not to persuade toward or away from treatment, but to equip families with the information — including its limitations — to participate meaningfully in the decision.</w:t>
       </w:r>
     </w:p>
     <w:p>

</xml_diff>